<commit_message>
Namuna 3.1.3-rasm: sinf chegaralari qizil, yorliqlar aniq
Co-Authored-By: Claude Opus 5.5 <noreply@anthropic.com>
Claude-Session: https://claude.ai/code/session_01PxHTC8Q7yHdrpAeUA5KUgM
</commit_message>
<xml_diff>
--- a/Namuna_3.1.3-rasm_dinamika.docx
+++ b/Namuna_3.1.3-rasm_dinamika.docx
@@ -903,7 +903,7 @@
           <w:b w:val="0"/>
           <w:sz w:val="22"/>
         </w:rPr>
-        <w:t>Izoh: uzluksiz chiziq – milliy hisobot, uzuq chiziq – MHXS; kulrang chiziqlar – I va II sinflar (3,25 ball) hamda II va III sinflar (2,50 ball) chegaralari.</w:t>
+        <w:t>Izoh: uzluksiz chiziq – milliy hisobot, uzuq chiziq – MHXS; qizil chiziqlar – I va II sinflar (3,25 ball) hamda II va III sinflar (2,50 ball) chegaralari.</w:t>
       </w:r>
     </w:p>
     <w:p>
@@ -24815,7 +24815,7 @@
           <c:yMode val="edge"/>
           <c:x val="0.11"/>
           <c:y val="0.04"/>
-          <c:w val="0.78"/>
+          <c:w val="0.7"/>
           <c:h val="0.84"/>
         </c:manualLayout>
       </c:layout>
@@ -25326,15 +25326,15 @@
               <c:strCache>
                 <c:ptCount val="1"/>
                 <c:pt idx="0">
-                  <c:v>I sinf chegarasi</c:v>
+                  <c:v>I va II sinflar chegarasi</c:v>
                 </c:pt>
               </c:strCache>
             </c:strRef>
           </c:tx>
           <c:spPr>
-            <a:ln w="12700">
+            <a:ln w="19050">
               <a:solidFill>
-                <a:srgbClr val="A6A6A6"/>
+                <a:srgbClr val="C00000"/>
               </a:solidFill>
               <a:prstDash val="sysDash"/>
             </a:ln>
@@ -25351,23 +25351,23 @@
                   <a:lstStyle/>
                   <a:p>
                     <a:pPr>
-                      <a:defRPr sz="900" b="0">
+                      <a:defRPr sz="1050" b="1">
                         <a:solidFill>
-                          <a:srgbClr val="7F7F7F"/>
+                          <a:srgbClr val="C00000"/>
                         </a:solidFill>
                         <a:latin typeface="Times New Roman"/>
                         <a:cs typeface="Times New Roman"/>
                       </a:defRPr>
                     </a:pPr>
                     <a:r>
-                      <a:rPr lang="uz-Latn-UZ" sz="900" b="0">
+                      <a:rPr lang="uz-Latn-UZ" sz="1050" b="1">
                         <a:solidFill>
-                          <a:srgbClr val="7F7F7F"/>
+                          <a:srgbClr val="C00000"/>
                         </a:solidFill>
                         <a:latin typeface="Times New Roman"/>
                         <a:cs typeface="Times New Roman"/>
                       </a:rPr>
-                      <a:t>3,25</a:t>
+                      <a:t>3,25 (I/II)</a:t>
                     </a:r>
                   </a:p>
                 </c:rich>
@@ -25451,15 +25451,15 @@
               <c:strCache>
                 <c:ptCount val="1"/>
                 <c:pt idx="0">
-                  <c:v>III sinf chegarasi</c:v>
+                  <c:v>II va III sinflar chegarasi</c:v>
                 </c:pt>
               </c:strCache>
             </c:strRef>
           </c:tx>
           <c:spPr>
-            <a:ln w="12700">
+            <a:ln w="19050">
               <a:solidFill>
-                <a:srgbClr val="A6A6A6"/>
+                <a:srgbClr val="C00000"/>
               </a:solidFill>
               <a:prstDash val="sysDash"/>
             </a:ln>
@@ -25476,23 +25476,23 @@
                   <a:lstStyle/>
                   <a:p>
                     <a:pPr>
-                      <a:defRPr sz="900" b="0">
+                      <a:defRPr sz="1050" b="1">
                         <a:solidFill>
-                          <a:srgbClr val="7F7F7F"/>
+                          <a:srgbClr val="C00000"/>
                         </a:solidFill>
                         <a:latin typeface="Times New Roman"/>
                         <a:cs typeface="Times New Roman"/>
                       </a:defRPr>
                     </a:pPr>
                     <a:r>
-                      <a:rPr lang="uz-Latn-UZ" sz="900" b="0">
+                      <a:rPr lang="uz-Latn-UZ" sz="1050" b="1">
                         <a:solidFill>
-                          <a:srgbClr val="7F7F7F"/>
+                          <a:srgbClr val="C00000"/>
                         </a:solidFill>
                         <a:latin typeface="Times New Roman"/>
                         <a:cs typeface="Times New Roman"/>
                       </a:rPr>
-                      <a:t>2,50</a:t>
+                      <a:t>2,50 (II/III)</a:t>
                     </a:r>
                   </a:p>
                 </c:rich>

</xml_diff>

<commit_message>
Namuna 3.1.3-rasm: chegara yozuvlari bo'sh joyda, bir qatorda
Co-Authored-By: Claude Opus 5.5 <noreply@anthropic.com>
Claude-Session: https://claude.ai/code/session_01PxHTC8Q7yHdrpAeUA5KUgM
</commit_message>
<xml_diff>
--- a/Namuna_3.1.3-rasm_dinamika.docx
+++ b/Namuna_3.1.3-rasm_dinamika.docx
@@ -24815,7 +24815,7 @@
           <c:yMode val="edge"/>
           <c:x val="0.11"/>
           <c:y val="0.04"/>
-          <c:w val="0.7"/>
+          <c:w val="0.8"/>
           <c:h val="0.84"/>
         </c:manualLayout>
       </c:layout>
@@ -25344,10 +25344,10 @@
           </c:marker>
           <c:dLbls>
             <c:dLbl>
-              <c:idx val="4"/>
+              <c:idx val="2"/>
               <c:tx>
                 <c:rich>
-                  <a:bodyPr/>
+                  <a:bodyPr wrap="none"/>
                   <a:lstStyle/>
                   <a:p>
                     <a:pPr>
@@ -25367,7 +25367,7 @@
                         <a:latin typeface="Times New Roman"/>
                         <a:cs typeface="Times New Roman"/>
                       </a:rPr>
-                      <a:t>3,25 (I/II)</a:t>
+                      <a:t>I va II sinflar chegarasi (3,25)</a:t>
                     </a:r>
                   </a:p>
                 </c:rich>
@@ -25378,7 +25378,7 @@
                   <a:noFill/>
                 </a:ln>
               </c:spPr>
-              <c:dLblPos val="r"/>
+              <c:dLblPos val="t"/>
               <c:showLegendKey val="0"/>
               <c:showVal val="1"/>
               <c:showCatName val="0"/>
@@ -25469,10 +25469,10 @@
           </c:marker>
           <c:dLbls>
             <c:dLbl>
-              <c:idx val="4"/>
+              <c:idx val="2"/>
               <c:tx>
                 <c:rich>
-                  <a:bodyPr/>
+                  <a:bodyPr wrap="none"/>
                   <a:lstStyle/>
                   <a:p>
                     <a:pPr>
@@ -25492,7 +25492,7 @@
                         <a:latin typeface="Times New Roman"/>
                         <a:cs typeface="Times New Roman"/>
                       </a:rPr>
-                      <a:t>2,50 (II/III)</a:t>
+                      <a:t>II va III sinflar chegarasi (2,50)</a:t>
                     </a:r>
                   </a:p>
                 </c:rich>
@@ -25503,7 +25503,7 @@
                   <a:noFill/>
                 </a:ln>
               </c:spPr>
-              <c:dLblPos val="r"/>
+              <c:dLblPos val="b"/>
               <c:showLegendKey val="0"/>
               <c:showVal val="1"/>
               <c:showCatName val="0"/>

</xml_diff>